<commit_message>
feat: refinar copy e experiência de produto
</commit_message>
<xml_diff>
--- a/public/curriculo-augusto-amado-2026.docx
+++ b/public/curriculo-augusto-amado-2026.docx
@@ -1,6 +1,6 @@
 
 <file path=word/document.xml><?xml version="1.0" encoding="utf-8"?>
-<w:document xmlns:ns1="http://schemas.openxmlformats.org/officeDocument/2006/relationships" xmlns:w="http://schemas.openxmlformats.org/wordprocessingml/2006/main">
+<w:document xmlns:r="http://schemas.openxmlformats.org/officeDocument/2006/relationships" xmlns:w="http://schemas.openxmlformats.org/wordprocessingml/2006/main">
   <w:body>
     <w:p>
       <w:pPr>
@@ -303,7 +303,7 @@
         </w:rPr>
         <w:t xml:space="preserve">LinkedIn: </w:t>
       </w:r>
-      <w:hyperlink ns1:id="docRId0">
+      <w:hyperlink r:id="docRId0">
         <w:r>
           <w:rPr>
             <w:rFonts w:ascii="Calibri" w:hAnsi="Calibri" w:cs="Calibri" w:eastAsia="Calibri"/>
@@ -343,7 +343,7 @@
         </w:rPr>
         <w:t xml:space="preserve">Portfólio: </w:t>
       </w:r>
-      <w:hyperlink ns1:id="docRId1">
+      <w:hyperlink r:id="docRId1">
         <w:r>
           <w:rPr>
             <w:rFonts w:ascii="Calibri" w:hAnsi="Calibri" w:cs="Calibri" w:eastAsia="Calibri"/>
@@ -861,7 +861,7 @@
           <w:sz w:val="22"/>
           <w:shd w:fill="FFFFFF" w:val="clear"/>
         </w:rPr>
-        <w:t xml:space="preserve">Frontend:</w:t>
+        <w:t xml:space="preserve">Frontend &amp; UX:</w:t>
       </w:r>
       <w:r>
         <w:rPr>
@@ -954,6 +954,17 @@
           <w:shd w:fill="FFFFFF" w:val="clear"/>
         </w:rPr>
         <w:t xml:space="preserve">shadcn/Radix UI</w:t>
+      </w:r>
+      <w:r>
+        <w:rPr>
+          <w:rFonts w:ascii="Roboto" w:hAnsi="Roboto" w:cs="Roboto" w:eastAsia="Roboto"/>
+          <w:color w:val="auto"/>
+          <w:spacing w:val="0"/>
+          <w:position w:val="0"/>
+          <w:sz w:val="22"/>
+          <w:shd w:fill="FFFFFF" w:val="clear"/>
+        </w:rPr>
+        <w:t xml:space="preserve">, responsividade desktop/mobile e validação de fluxos</w:t>
       </w:r>
     </w:p>
     <w:p>
@@ -3355,7 +3366,7 @@
           <w:sz w:val="24"/>
           <w:shd w:fill="auto" w:val="clear"/>
         </w:rPr>
-        <w:t xml:space="preserve">, validação de novas features e melhoria contínua do que já está em produção;</w:t>
+        <w:t xml:space="preserve"> e valido features em desktop/mobile, ajustando usabilidade, responsividade e melhoria contínua do produto em produção;</w:t>
       </w:r>
     </w:p>
     <w:p>

</xml_diff>

<commit_message>
fix: padronizar cor dos links do currículo em português
Iguala a cor do LinkedIn e do Portfólio ao azul de hyperlink do
resume em inglês (0563C1). Antes o LinkedIn renderizava preto e o
Portfólio em outro tom de azul.

Co-Authored-By: Claude Opus 4.8 <noreply@anthropic.com>
</commit_message>
<xml_diff>
--- a/public/curriculo-augusto-amado-2026.docx
+++ b/public/curriculo-augusto-amado-2026.docx
@@ -307,7 +307,7 @@
         <w:r>
           <w:rPr>
             <w:rFonts w:ascii="Calibri" w:hAnsi="Calibri" w:cs="Calibri" w:eastAsia="Calibri"/>
-            <w:color w:val="000000"/>
+            <w:color w:val="0563C1"/>
             <w:spacing w:val="0"/>
             <w:position w:val="0"/>
             <w:sz w:val="24"/>
@@ -347,7 +347,7 @@
         <w:r>
           <w:rPr>
             <w:rFonts w:ascii="Calibri" w:hAnsi="Calibri" w:cs="Calibri" w:eastAsia="Calibri"/>
-            <w:color w:val="0000FF"/>
+            <w:color w:val="0563C1"/>
             <w:spacing w:val="0"/>
             <w:position w:val="0"/>
             <w:sz w:val="24"/>

</xml_diff>

<commit_message>
feat: adicionar Go, FastAPI, pgvector e RAG nas competências dos currículos
Co-Authored-By: Claude Opus 4.8 <noreply@anthropic.com>
</commit_message>
<xml_diff>
--- a/public/curriculo-augusto-amado-2026.docx
+++ b/public/curriculo-augusto-amado-2026.docx
@@ -592,7 +592,7 @@
           <w:sz w:val="22"/>
           <w:shd w:fill="FFFFFF" w:val="clear"/>
         </w:rPr>
-        <w:t xml:space="preserve">prompt engineering</w:t>
+        <w:t xml:space="preserve">prompt engineering, RAG (busca híbrida vetorial + full-text)</w:t>
       </w:r>
       <w:r>
         <w:rPr>
@@ -692,7 +692,7 @@
           <w:sz w:val="22"/>
           <w:shd w:fill="FFFFFF" w:val="clear"/>
         </w:rPr>
-        <w:t xml:space="preserve">Express</w:t>
+        <w:t xml:space="preserve">Express, Go, Python (FastAPI)</w:t>
       </w:r>
       <w:r>
         <w:rPr>
@@ -1041,7 +1041,7 @@
           <w:sz w:val="22"/>
           <w:shd w:fill="FFFFFF" w:val="clear"/>
         </w:rPr>
-        <w:t xml:space="preserve">PostgreSQL</w:t>
+        <w:t xml:space="preserve">PostgreSQL, pgvector</w:t>
       </w:r>
       <w:r>
         <w:rPr>

</xml_diff>